<commit_message>
Revise manuscript against advisor comments
Co-authored-by: C20-end <C20-end@users.noreply.github.com>
</commit_message>
<xml_diff>
--- a/社交媒体视角下公众对生成式人工智能医疗应用的认知模式研究——一项基于文本挖掘的分析.docx
+++ b/社交媒体视角下公众对生成式人工智能医疗应用的认知模式研究——一项基于文本挖掘的分析.docx
@@ -57,7 +57,7 @@
           <w:sz w:val="21"/>
           <w:szCs w:val="21"/>
         </w:rPr>
-        <w:t xml:space="preserve">摘　要：随着生成式人工智能逐步进入健康咨询、报告解读、患者沟通与临床辅助等医疗场景，公众如何理解其技术能力、医生角色、潜在风险及人机关系，成为影响技术应用的重要因素。既有研究多采用问卷或情景实验测量接受意愿，社交媒体研究则主要关注情感倾向或主题类别，尚不足以揭示同一态度内部的认知差异。本文回溯采集微博、抖音、小红书和知乎中围绕AI医生、AI问诊及医疗大模型的中文评论，经数据清洗、相关性识别和态度分类，获得相关评论103,731条，其中71,886条具有明确态度。在有态度文本中构建评论内词共现网络，以Louvain识别的14个词簇为分析单位，从AI能力、医生角色、风险认知和人机关系四个维度进行编码。结果显示，积极评论占相关评论的52.4%，占有态度评论的75.6%；积极态度内部呈现技术崇拜、务实认可和人机协同等不同配置，中立态度主要体现人机协同，消极态度则表现为技术恐惧和风险责任两类配置。研究将公众态度分析由评价效价推进至多维认知配置，表明积极评价并不等同于认可AI独立诊断，风险问责也不必然意味着拒绝技术，可为医疗机构开展能力边界、医生监督和责任机制沟通提供参考。</w:t>
+        <w:t xml:space="preserve">摘　要：随着生成式人工智能逐步进入健康咨询、报告解读、患者沟通与临床辅助等医疗场景，公众如何理解其技术能力、医生角色、潜在风险及人机关系，成为影响技术应用的重要因素。既有研究多采用问卷或情景实验测量接受意愿，社交媒体研究则主要关注情感倾向或主题类别，尚不足以揭示同一态度内部的认知差异。本文回溯采集微博、抖音、小红书和知乎中围绕AI医生、AI问诊及医疗大模型的中文评论，经数据清洗、相关性识别和态度分类，获得相关评论103,731条，其中71,886条具有明确态度。在有态度文本中构建评论内词共现网络，以Louvain识别的14个词簇为分析单位，从AI能力、医生角色、风险认知和人机关系四个维度进行编码。结果显示，积极评论占相关评论的52.4%，占有态度评论的75.6%；积极态度内部呈现技术崇拜、务实认可和人机协同等不同配置，中立态度主要体现人机协同，消极态度则表现为技术恐惧和风险责任两类配置。研究将公众态度分析由评价效价推进至多维认知配置，表明积极评价并不等同于认可AI独立诊断，风险问责也不必然意味着拒绝技术，可为医疗机构开展能力边界、医生监督和责任机制沟通，以及促进公众形成与技术能力和应用风险相匹配的理性认知提供参考。</w:t>
       </w:r>
     </w:p>
     <w:p>
@@ -299,7 +299,7 @@
           <w:sz w:val="24"/>
           <w:szCs w:val="24"/>
         </w:rPr>
-        <w:t xml:space="preserve">2.1　公众对生成式人工智能医疗应用的条件性接受</w:t>
+        <w:t xml:space="preserve">2.1　生成式人工智能医疗应用的公众认知与态度</w:t>
       </w:r>
     </w:p>
     <w:p>
@@ -380,7 +380,7 @@
           <w:sz w:val="24"/>
           <w:szCs w:val="24"/>
         </w:rPr>
-        <w:t xml:space="preserve">2.2　算法欣赏、算法厌恶与态度极性的差异</w:t>
+        <w:t xml:space="preserve">2.2　生成式人工智能医疗应用认知中的算法欣赏与算法厌恶</w:t>
       </w:r>
     </w:p>
     <w:p>
@@ -413,7 +413,7 @@
           <w:sz w:val="24"/>
           <w:szCs w:val="24"/>
         </w:rPr>
-        <w:t xml:space="preserve">2.3　人机互补与生成式人工智能医疗应用的角色配置</w:t>
+        <w:t xml:space="preserve">2.3　人机互补与生成式人工智能医疗应用的理性认知</w:t>
       </w:r>
     </w:p>
     <w:p>
@@ -429,7 +429,7 @@
           <w:sz w:val="21"/>
           <w:szCs w:val="21"/>
         </w:rPr>
-        <w:t xml:space="preserve">人机互补为理解生成式人工智能与医生之间的合理角色配置提供了理论参照，而非对公众实际认知状态的预先判定。该理论认为，人工智能价值的实现并不以完全替代人类为前提，而在于根据双方的能力边界进行任务分工，使组合绩效超过任一主体单独行动〔27-28〕。生成式模型在信息检索、文本生成、模式归纳和高频交互方面具有优势，医生则承担情境化临床判断、身体检查、价值权衡、同理沟通和最终责任。相较于将流畅表达直接理解为独立诊疗能力，或因潜在错误而否定全部辅助价值，更为审慎的认知是将技术置于具有明确适用范围、医生监督和可追溯责任的协作结构之中。</w:t>
+        <w:t xml:space="preserve">人机互补为界定生成式人工智能与医生之间的合理角色配置提供了理论参照。该理论认为，人工智能价值的实现并不以完全替代人类为前提，而在于根据双方的能力边界进行任务分工，使组合绩效超过任一主体单独行动〔27-28〕。生成式模型在信息检索、文本生成、模式归纳和高频交互方面具有优势，医生则承担情境化临床判断、身体检查、价值权衡、同理沟通和最终责任。本文所称“理性认知”并非对评论者进行价值分级，而是指对系统能力、适用边界、潜在风险与责任机制形成相互匹配的判断。相较于将流畅表达直接理解为独立诊疗能力，或因潜在错误而否定全部辅助价值，将技术置于具有明确适用范围、医生监督和可追溯责任的协作结构之中，更符合人机互补的基本要求。</w:t>
       </w:r>
     </w:p>
     <w:p>
@@ -16222,7 +16222,7 @@
           <w:sz w:val="24"/>
           <w:szCs w:val="24"/>
         </w:rPr>
-        <w:t>5.2　人机互补与协同认知的形成</w:t>
+        <w:t xml:space="preserve">5.2　人机互补与理性认知的形成</w:t>
       </w:r>
     </w:p>
     <w:p>
@@ -16254,7 +16254,7 @@
           <w:sz w:val="21"/>
           <w:szCs w:val="21"/>
         </w:rPr>
-        <w:t xml:space="preserve">需要指出的是，人机协同模式并不等同于中立态度，更不能据此将某一态度群体概括为更理性。积极组中同样存在协同词簇，只是其风险讨论相对较少；中立词簇则更明确地同时表达技术收益和应用边界。换言之，态度类别描述评价方向，协同模式描述角色配置，二者属于不同分析层次。本文所称认知校准，是指话语中的能力、风险和责任判断与人机互补框架之间的匹配程度，而非对评论者作价值评价。</w:t>
+        <w:t xml:space="preserve">需要指出的是，理性认知并不等同于中立态度，也不能据此将某一态度群体概括为更理性。积极组中同样存在协同词簇，只是其风险讨论相对较少；中立词簇则更明确地同时表达技术收益和应用边界。换言之，态度类别描述评价方向，协同模式描述角色配置，二者属于不同分析层次。本文所谓理性认知，是指话语中的能力、风险和责任判断与人机互补框架之间的匹配程度，而非对评论者作价值评价。</w:t>
       </w:r>
     </w:p>
     <w:p>

</xml_diff>